<commit_message>
Add publication-readiness validation and reporting package
</commit_message>
<xml_diff>
--- a/manuscript/Revised_archaeal_DBD_manuscript.docx
+++ b/manuscript/Revised_archaeal_DBD_manuscript.docx
@@ -63,7 +63,7 @@
         <w:jc w:val="center"/>
       </w:pPr>
       <w:r>
-        <w:t>Keywords: Archaea; DNA binding domain; helix turn helix; ribbon helix helix; comparative genomics; protein structure</w:t>
+        <w:t>Keywords: Archaea; DNA-binding domain; helix-turn-helix; ribbon-helix-helix; comparative genomics; protein structure</w:t>
       </w:r>
     </w:p>
     <w:p>
@@ -80,7 +80,7 @@
         <w:pStyle w:val="BodyText"/>
       </w:pPr>
       <w:r>
-        <w:t>Archaeal regulatory annotation is dominated by a small set of familiar helix turn helix, ribbon helix helix, and metal responsive families. We asked how much additional sequence diversity is visible within the two Pfam clans that contain these domain classes after a nineteen family reference set is removed. This is a bounded catalog of noncanonical HTH and RHH clan members, not a comprehensive census of all archaeal DNA binding proteins or transcription factors. A reproducible rule retained all genomes from five underrepresented archaeal groups and capped the two largest groups, yielding 331 genomes and 804,755 proteins. Of 38,153 proteins assigned to the two target clans, 16,535 belonged to the reference set, 14,451 carried another characterized domain, and 7,167 were uncharacterized. Clustering the noncanonical fraction at 30 percent identity and 60 percent coverage, followed by size, genome count, and nonregulatory filters, defined 250 candidate families with 13,237 members. Family HMMs assigned held out members with 97.3 percent accuracy. In 500 lineage matched samples of 331 independent projection genomes, a median of 245 families were detected at least once. Genome level motif holdout tests found consistent discrimination from GC matched other family upstreams for 10 of 12 tested families. Structural and conserved domain comparisons resolved most apparently dark families: 56 of 79 had a Conserved Domain Database match and 14 more had a recognized fold, leaving nine unresolved by the resources tested. Genomic neighborhood and upstream sequence analyses nominate testable functions, but do not establish direct regulation. The result is a scoped, reproducible map of sequence families that expands annotation beyond a standard reference set and identifies a small set of high priority targets for biochemical validation.</w:t>
+        <w:t>Archaeal regulatory annotation is dominated by a small set of familiar helix-turn-helix, ribbon-helix-helix, and metal responsive families. We asked how much additional sequence diversity is visible within the two Pfam clans that contain these domain classes after a nineteen family reference set is removed. This is a bounded catalog of noncanonical HTH and RHH clan members, not a comprehensive census of all archaeal DNA-binding proteins or transcription factors. A reproducible rule retained all genomes from five underrepresented archaeal groups and capped the two largest groups, yielding 331 genomes and 804,755 proteins. Of 38,153 proteins assigned to the two target clans, 16,535 belonged to the reference set, 14,451 carried another characterized domain, and 7,167 were uncharacterized. Clustering the noncanonical fraction at 30 percent identity and 60 percent coverage, followed by size, genome count, and nonregulatory filters, defined 250 candidate families with 13,237 members. Family HMMs assigned held out members with 97.3 percent accuracy. In 500 lineage-matched samples of 331 independent projection genomes, a median of 245 families were detected at least once. Genome-level motif holdout tests found consistent discrimination from GC matched other family upstreams for 10 of 12 tested families. Structural and conserved domain comparisons resolved most apparently dark families: 56 of 79 had a Conserved Domain Database match and 14 more had a recognized fold, leaving nine unresolved by the resources tested. Genomic neighborhood and upstream sequence analyses nominate testable functions, but do not establish direct regulation. The result is a scoped, reproducible catalog of sequence families that expands annotation beyond a standard reference set and identifies a small set of high priority targets for biochemical validation.</w:t>
       </w:r>
     </w:p>
     <w:p>
@@ -105,7 +105,7 @@
         <w:pStyle w:val="BodyText"/>
       </w:pPr>
       <w:r>
-        <w:t>A protein that carries a small DNA binding fold is not necessarily a transcription factor. Related domains occur in antitoxins, defense and mobile element proteins, chromosome proteins, and enzymes involved in DNA transactions. Sequence, structure, genomic neighborhood, motif, phylogenetic, and expression evidence therefore answer different questions. In this study, DNA binding domain protein denotes a sequence assigned to the targeted HTH or RHH Pfam clans. Candidate regulator denotes a family with additional contextual evidence. Transcription factor is reserved for experimentally demonstrated regulatory activity.</w:t>
+        <w:t>A protein that carries a small DNA-binding fold is not necessarily a transcription factor. Related domains occur in antitoxins, defense and mobile element proteins, chromosome proteins, and enzymes involved in DNA transactions. Sequence, structure, genomic neighborhood, motif, phylogenetic, and expression evidence therefore answer different questions. In this study, DNA-binding domain protein denotes a sequence assigned to the targeted HTH or RHH Pfam clans. Candidate regulator denotes a family with additional contextual evidence. Transcription factor is reserved for experimentally demonstrated regulatory activity.</w:t>
       </w:r>
     </w:p>
     <w:p>
@@ -113,7 +113,7 @@
         <w:pStyle w:val="BodyText"/>
       </w:pPr>
       <w:r>
-        <w:t>Our question is deliberately narrower than a survey of every archaeal DNA binding protein. We examine members of Pfam clans CL0123 and CL0057 that are not explained by a nineteen family reference set, group them into reproducible families, map their distribution, and prioritize families for experiments. Proteins outside these clans, highly diverged sequences missed by their profiles, and non HTH or RHH DNA binding mechanisms are outside the search universe.</w:t>
+        <w:t>Our question is deliberately narrower than a survey of every archaeal DNA-binding protein. We examine members of Pfam clans CL0123 and CL0057 that are not explained by a nineteen family reference set, group them into reproducible families, map their distribution, and prioritize families for experiments. Proteins outside these clans, highly diverged sequences missed by their profiles, and non HTH or RHH DNA-binding mechanisms are outside the search universe.</w:t>
       </w:r>
     </w:p>
     <w:p>
@@ -538,7 +538,7 @@
         <w:pStyle w:val="BodyText"/>
       </w:pPr>
       <w:r>
-        <w:t>We scanned the 331 proteomes against profiles from Pfam clans CL0123 and CL0057 after removing the twenty profile models used to represent the nineteen canonical families. Candidate and canonical matches were compared on the aligned domain interval, not on an upstream DNA regulatory region. For each protein, the highest scoring candidate interval was retained. A canonical hit excluded that candidate only when it overlapped more than half of the candidate interval and its domain bit score was no more than 5 bits below the candidate score. Thus the 5 bit value is a score tolerance in a reciprocal domain assignment rule; it is not a biological threshold. Because the released archive does not contain the complete prefilter hit tables, its sensitivity cannot be recomputed here and remains a limitation.</w:t>
+        <w:t>We scanned the 331 proteomes against profiles from Pfam clans CL0123 and CL0057 after removing the twenty profile models used to represent the nineteen canonical families. Candidate and canonical matches were compared on the aligned domain interval, not on an upstream DNA regulatory region. For each protein, the highest scoring candidate interval was retained. A canonical hit excluded that candidate only when it overlapped more than half of the candidate interval and its domain bit score was no more than 5-bits below the candidate score. Thus the 5-bit value is a score tolerance in a reciprocal domain assignment rule; it is not a biological threshold. Because the released archive does not contain the complete prefilter hit tables, its sensitivity cannot be recomputed here and remains a limitation.</w:t>
       </w:r>
     </w:p>
     <w:p>
@@ -556,7 +556,7 @@
       <w:r>
         <w:drawing>
           <wp:inline xmlns:a="http://schemas.openxmlformats.org/drawingml/2006/main" xmlns:pic="http://schemas.openxmlformats.org/drawingml/2006/picture">
-            <wp:extent cx="5623560" cy="3371159"/>
+            <wp:extent cx="5852160" cy="3336976"/>
             <wp:docPr id="1" name="Picture 1"/>
             <wp:cNvGraphicFramePr>
               <a:graphicFrameLocks noChangeAspect="1"/>
@@ -565,11 +565,11 @@
               <a:graphicData uri="http://schemas.openxmlformats.org/drawingml/2006/picture">
                 <pic:pic>
                   <pic:nvPicPr>
-                    <pic:cNvPr id="0" name="Figure02_regulatory_domain_tiers.png"/>
+                    <pic:cNvPr id="0" name="Figure2_targeted_DBD_annotation_composition.png"/>
                     <pic:cNvPicPr/>
                   </pic:nvPicPr>
                   <pic:blipFill>
-                    <a:blip r:embed="rId11"/>
+                    <a:blip r:embed="rId17"/>
                     <a:stretch>
                       <a:fillRect/>
                     </a:stretch>
@@ -577,7 +577,7 @@
                   <pic:spPr>
                     <a:xfrm>
                       <a:off x="0" y="0"/>
-                      <a:ext cx="5623560" cy="3371159"/>
+                      <a:ext cx="5852160" cy="3336976"/>
                     </a:xfrm>
                     <a:prstGeom prst="rect"/>
                   </pic:spPr>
@@ -593,7 +593,7 @@
         <w:pStyle w:val="Caption"/>
       </w:pPr>
       <w:r>
-        <w:t>Figure 1. Composition of the targeted HTH and RHH clan proteins in the 331 genome panel. The noncanonical categories are defined relative to the nineteen family reference set and should not be read as all archaeal DNA binding proteins.</w:t>
+        <w:t>Figure 1. Annotation composition of the targeted archaeal DBD panel. Fractions are calculated only among proteins detected through Pfam clans CL0123 and CL0057. “Without characterized family assignment” is an operational annotation category, not evidence of a new fold or function.</w:t>
       </w:r>
     </w:p>
     <w:p>
@@ -610,7 +610,7 @@
         <w:pStyle w:val="BodyText"/>
       </w:pPr>
       <w:r>
-        <w:t>The noncanonical proteins were clustered with MMseqs2 at 30 percent sequence identity and 60 percent coverage. We retained clusters with a median protein length below 250 amino acids, at least 60 percent of members below 250 amino acids, and occurrence in at least five panel genomes, then removed clusters carrying keywords associated with clearly nonregulatory functions. This produced 250 candidate families, nArcR 1 through nArcR 250, comprising 13,237 proteins. Of the families, 171 have a characterized domain outside the reference set and 79 were uncharacterized by Pfam. Accordingly, the main novelty is the family level organization and archaeal distribution of noncanonical clan members, not 250 newly discovered DNA binding folds.</w:t>
+        <w:t>The noncanonical proteins were clustered with MMseqs2 at 30 percent sequence identity and 60 percent coverage. We retained clusters with a median protein length below 250 amino acids, at least 60 percent of members below 250 amino acids, and occurrence in at least five panel genomes, then removed clusters carrying keywords associated with clearly nonregulatory functions. This produced 250 candidate families, nArcR 1 through nArcR 250, comprising 13,237 proteins. Of the families, 171 have a characterized domain outside the reference set and 79 were uncharacterized by Pfam. Accordingly, the main novelty is the family level organization and archaeal distribution of noncanonical clan members, not 250 newly discovered DNA-binding folds.</w:t>
       </w:r>
     </w:p>
     <w:p>
@@ -645,7 +645,7 @@
       <w:r>
         <w:drawing>
           <wp:inline xmlns:a="http://schemas.openxmlformats.org/drawingml/2006/main" xmlns:pic="http://schemas.openxmlformats.org/drawingml/2006/picture">
-            <wp:extent cx="5806440" cy="2253900"/>
+            <wp:extent cx="5852160" cy="2271646"/>
             <wp:docPr id="2" name="Picture 2"/>
             <wp:cNvGraphicFramePr>
               <a:graphicFrameLocks noChangeAspect="1"/>
@@ -654,7 +654,7 @@
               <a:graphicData uri="http://schemas.openxmlformats.org/drawingml/2006/picture">
                 <pic:pic>
                   <pic:nvPicPr>
-                    <pic:cNvPr id="0" name="FigureS5_panel_resampling_sensitivity.png"/>
+                    <pic:cNvPr id="0" name="image.png"/>
                     <pic:cNvPicPr/>
                   </pic:nvPicPr>
                   <pic:blipFill>
@@ -666,7 +666,7 @@
                   <pic:spPr>
                     <a:xfrm>
                       <a:off x="0" y="0"/>
-                      <a:ext cx="5806440" cy="2253900"/>
+                      <a:ext cx="5852160" cy="2271646"/>
                     </a:xfrm>
                     <a:prstGeom prst="rect"/>
                   </pic:spPr>
@@ -707,7 +707,7 @@
         <w:pStyle w:val="BodyText"/>
       </w:pPr>
       <w:r>
-        <w:t>Projection placed the families across an accounting set of 3,526 archaeal genomes: 1,324 isolates, 1,986 metagenome assembled genomes, and 216 single amplified genomes. Corrected prevalence was recomputed against the full lineage denominators after 379 initially zero hit genomes were rescued by HMM scanning. The released raw presence absence and copy number matrices contain only the earlier 3,192 genome pass; therefore corrected prevalence tables, not those legacy matrices, support the 3,526 genome summaries. Because MAGs and SAGs may be incomplete, no confident hit is not equivalent to confirmed biological absence.</w:t>
+        <w:t>Projection placed the families across an accounting set of 3,526 archaeal genomes: 1,324 isolates, 1,986 metagenome-assembled genomes, and 216 single-amplified genomes. Corrected prevalence was recomputed against the full lineage denominators after 379 initially zero hit genomes were rescued by HMM scanning. The released raw presence absence and copy number matrices contain only the earlier 3,192 genome pass; therefore corrected prevalence tables, not those legacy matrices, support the 3,526 genome summaries. Because MAGs and SAGs may be incomplete, no confident hit is not equivalent to confirmed biological absence.</w:t>
       </w:r>
     </w:p>
     <w:p>
@@ -715,17 +715,25 @@
         <w:pStyle w:val="BodyText"/>
       </w:pPr>
       <w:r>
-        <w:t>We tested profile transfer on accessions outside the discovery panel by drawing 500 lineage matched samples of 331 genomes from the released 3,192 genome projection matrix. The samples used the discovery panel lineage counts and had zero accession overlap with the discovery set. A median of 245 of 250 families was detected at least once in each sample (95 percent interval 242 to 248), and a median of 206 occurred in at least five genomes (198 to 215). This result supports transferability of the released family HMMs to independent genomes. It does not test whether the full scan and clustering workflow would rediscover the same family boundaries.</w:t>
+        <w:t>We tested profile transfer on accessions outside the discovery panel by drawing 500 lineage-matched samples of 331 genomes from the released 3,192 genome projection matrix. The samples used the discovery panel lineage counts and had zero accession overlap with the discovery set. A median of 245 of 250 families was detected at least once in each sample (95 percent interval 242 to 248), and a median of 206 occurred in at least five genomes (198 to 215). This result supports transferability of the released family HMMs to independent genomes. It does not test whether the full scan and clustering workflow would rediscover the same family boundaries.</w:t>
       </w:r>
     </w:p>
     <w:p>
       <w:pPr>
+        <w:pStyle w:val="BodyText"/>
+      </w:pPr>
+      <w:r>
+        <w:t>We next stratified the accession-resolved 3,192-genome projection by genome origin, assembly level, and reported completeness/contamination. Each stratum retained 242–249 of the 250 families, except the smaller single-amplified-genome stratum, which retained 205. Median per-family prevalence varied from 0.025 in MAGs to 0.068 in isolates and from 0.034 in scaffold assemblies to 0.072 in complete/chromosome assemblies. These descriptive shifts are confounded by lineage and sampling, but they show why non-detection and cross-stratum prevalence differences must be interpreted conservatively.</w:t>
+      </w:r>
+    </w:p>
+    <w:p>
+      <w:pPr>
         <w:jc w:val="center"/>
       </w:pPr>
       <w:r>
         <w:drawing>
           <wp:inline xmlns:a="http://schemas.openxmlformats.org/drawingml/2006/main" xmlns:pic="http://schemas.openxmlformats.org/drawingml/2006/picture">
-            <wp:extent cx="5532120" cy="2433352"/>
+            <wp:extent cx="5852160" cy="4251751"/>
             <wp:docPr id="3" name="Picture 3"/>
             <wp:cNvGraphicFramePr>
               <a:graphicFrameLocks noChangeAspect="1"/>
@@ -734,11 +742,11 @@
               <a:graphicData uri="http://schemas.openxmlformats.org/drawingml/2006/picture">
                 <pic:pic>
                   <pic:nvPicPr>
-                    <pic:cNvPr id="0" name="Figure03_prevalence_vs_breadth.png"/>
+                    <pic:cNvPr id="0" name="Figure3_catalogued_family_prevalence_breadth.png"/>
                     <pic:cNvPicPr/>
                   </pic:nvPicPr>
                   <pic:blipFill>
-                    <a:blip r:embed="rId13"/>
+                    <a:blip r:embed="rId18"/>
                     <a:stretch>
                       <a:fillRect/>
                     </a:stretch>
@@ -746,7 +754,7 @@
                   <pic:spPr>
                     <a:xfrm>
                       <a:off x="0" y="0"/>
-                      <a:ext cx="5532120" cy="2433352"/>
+                      <a:ext cx="5852160" cy="4251751"/>
                     </a:xfrm>
                     <a:prstGeom prst="rect"/>
                   </pic:spPr>
@@ -762,7 +770,7 @@
         <w:pStyle w:val="Caption"/>
       </w:pPr>
       <w:r>
-        <w:t>Figure 3. Family prevalence and phylogenetic breadth using the corrected projection summaries. Broadly distributed families form a small head, while many families have restricted distributions. Absence in incomplete assemblies should be treated as a lower bound on prevalence.</w:t>
+        <w:t>Figure 3. Prevalence and taxonomic breadth of catalogued DBD families. Point size reflects family membership. “Candidate noncanonical family” means outside the nineteen-family reference set within the two-clan search universe; it does not imply experimentally demonstrated regulatory function.</w:t>
       </w:r>
     </w:p>
     <w:p>
@@ -772,7 +780,7 @@
       <w:r>
         <w:drawing>
           <wp:inline xmlns:a="http://schemas.openxmlformats.org/drawingml/2006/main" xmlns:pic="http://schemas.openxmlformats.org/drawingml/2006/picture">
-            <wp:extent cx="5166360" cy="7547504"/>
+            <wp:extent cx="5852160" cy="6769827"/>
             <wp:docPr id="4" name="Picture 4"/>
             <wp:cNvGraphicFramePr>
               <a:graphicFrameLocks noChangeAspect="1"/>
@@ -781,11 +789,11 @@
               <a:graphicData uri="http://schemas.openxmlformats.org/drawingml/2006/picture">
                 <pic:pic>
                   <pic:nvPicPr>
-                    <pic:cNvPr id="0" name="Figure06_cross_phylum_prevalence.png"/>
+                    <pic:cNvPr id="0" name="Figure4_cross_lineage_catalogue_prevalence.png"/>
                     <pic:cNvPicPr/>
                   </pic:nvPicPr>
                   <pic:blipFill>
-                    <a:blip r:embed="rId14"/>
+                    <a:blip r:embed="rId19"/>
                     <a:stretch>
                       <a:fillRect/>
                     </a:stretch>
@@ -793,7 +801,7 @@
                   <pic:spPr>
                     <a:xfrm>
                       <a:off x="0" y="0"/>
-                      <a:ext cx="5166360" cy="7547504"/>
+                      <a:ext cx="5852160" cy="6769827"/>
                     </a:xfrm>
                     <a:prstGeom prst="rect"/>
                   </pic:spPr>
@@ -809,7 +817,7 @@
         <w:pStyle w:val="Caption"/>
       </w:pPr>
       <w:r>
-        <w:t>Figure 4. Corrected cross lineage prevalence of the 250 families. Values use the full 3,526 genome denominators and should be interpreted as confident detections rather than definitive absences.</w:t>
+        <w:t>Figure 4. Corrected cross-lineage prevalence for the 40 catalogued families with the highest mean prevalence. Values use the full 3,526-genome group denominators and should be interpreted as confident detections rather than definitive absences.</w:t>
       </w:r>
     </w:p>
     <w:p>
@@ -847,12 +855,20 @@
     </w:p>
     <w:p>
       <w:pPr>
+        <w:pStyle w:val="BodyText"/>
+      </w:pPr>
+      <w:r>
+        <w:t>To reduce phylogenetic leakage further, we repeated motif learning while holding out complete genera. Train and test sets had zero genus overlap in every split. Seven of 12 families discriminated held-out family upstreams from GC-matched other-family upstreams in at least 26 of 30 resamples; eleven of 12 did so against dinucleotide-shuffled controls. The reduced support relative to genome-level splitting indicates that some apparent signal is lineage-associated and narrows the set of motifs prioritized for experiment.</w:t>
+      </w:r>
+    </w:p>
+    <w:p>
+      <w:pPr>
         <w:jc w:val="center"/>
       </w:pPr>
       <w:r>
         <w:drawing>
           <wp:inline xmlns:a="http://schemas.openxmlformats.org/drawingml/2006/main" xmlns:pic="http://schemas.openxmlformats.org/drawingml/2006/picture">
-            <wp:extent cx="5715000" cy="5418919"/>
+            <wp:extent cx="5852160" cy="4337794"/>
             <wp:docPr id="5" name="Picture 5"/>
             <wp:cNvGraphicFramePr>
               <a:graphicFrameLocks noChangeAspect="1"/>
@@ -861,11 +877,11 @@
               <a:graphicData uri="http://schemas.openxmlformats.org/drawingml/2006/picture">
                 <pic:pic>
                   <pic:nvPicPr>
-                    <pic:cNvPr id="0" name="Figure04_predicted_regulon_heatmap.png"/>
+                    <pic:cNvPr id="0" name="Figure4_genomic_neighborhood_associations.png"/>
                     <pic:cNvPicPr/>
                   </pic:nvPicPr>
                   <pic:blipFill>
-                    <a:blip r:embed="rId15"/>
+                    <a:blip r:embed="rId20"/>
                     <a:stretch>
                       <a:fillRect/>
                     </a:stretch>
@@ -873,7 +889,7 @@
                   <pic:spPr>
                     <a:xfrm>
                       <a:off x="0" y="0"/>
-                      <a:ext cx="5715000" cy="5418919"/>
+                      <a:ext cx="5852160" cy="4337794"/>
                     </a:xfrm>
                     <a:prstGeom prst="rect"/>
                   </pic:spPr>
@@ -889,7 +905,7 @@
         <w:pStyle w:val="Caption"/>
       </w:pPr>
       <w:r>
-        <w:t>Figure 5. Genomic neighborhood enrichment for selected families. The heatmap is a hypothesis map. Only the strongest associations were retained by the dependence aware genus collapse and block permutation checks, and none establishes direct transcriptional regulation.</w:t>
+        <w:t>Figure 5. Significant genomic-neighborhood associations for selected catalogued families. Color encodes log2 fold enrichment in the initial deposited table. Associations generate functional hypotheses and do not establish direct transcriptional regulation; dependence-corrected source tables remain a documented deposition gap.</w:t>
       </w:r>
     </w:p>
     <w:p>
@@ -906,7 +922,7 @@
         <w:pStyle w:val="BodyText"/>
       </w:pPr>
       <w:r>
-        <w:t>Structural comparisons were available for 184 family representatives. Using a curated reference of 66 DNA binding and non DNA binding folds and a TM score threshold of 0.55, 175 representatives matched a known DNA binding fold and nine had no match among the tested references. The latter are candidates for further structural investigation, not established new folds. The reference library is curated rather than exhaustive, and nine families lacked a scored structure.</w:t>
+        <w:t>Structural comparisons were available for 184 family representatives. Using a curated reference of 66 DNA-binding and non DNA-binding folds and a TM score threshold of 0.55, 175 representatives matched a known DNA-binding fold and nine had no match among the tested references. The latter are candidates for further structural investigation, not established new folds. The reference library is curated rather than exhaustive, and nine families lacked a scored structure.</w:t>
       </w:r>
     </w:p>
     <w:p>
@@ -924,7 +940,7 @@
       <w:r>
         <w:drawing>
           <wp:inline xmlns:a="http://schemas.openxmlformats.org/drawingml/2006/main" xmlns:pic="http://schemas.openxmlformats.org/drawingml/2006/picture">
-            <wp:extent cx="5303520" cy="2110343"/>
+            <wp:extent cx="5852160" cy="3314089"/>
             <wp:docPr id="6" name="Picture 6"/>
             <wp:cNvGraphicFramePr>
               <a:graphicFrameLocks noChangeAspect="1"/>
@@ -933,11 +949,11 @@
               <a:graphicData uri="http://schemas.openxmlformats.org/drawingml/2006/picture">
                 <pic:pic>
                   <pic:nvPicPr>
-                    <pic:cNvPr id="0" name="Figure11_uncharacterized_db_comparison.png"/>
+                    <pic:cNvPr id="0" name="Figure6_uncharacterized_family_resolution.png"/>
                     <pic:cNvPicPr/>
                   </pic:nvPicPr>
                   <pic:blipFill>
-                    <a:blip r:embed="rId16"/>
+                    <a:blip r:embed="rId21"/>
                     <a:stretch>
                       <a:fillRect/>
                     </a:stretch>
@@ -945,7 +961,7 @@
                   <pic:spPr>
                     <a:xfrm>
                       <a:off x="0" y="0"/>
-                      <a:ext cx="5303520" cy="2110343"/>
+                      <a:ext cx="5852160" cy="3314089"/>
                     </a:xfrm>
                     <a:prstGeom prst="rect"/>
                   </pic:spPr>
@@ -995,7 +1011,7 @@
         <w:pStyle w:val="BodyText"/>
       </w:pPr>
       <w:r>
-        <w:t>The result is narrower than the original framing of a domain wide map of transcription factors. The workflow begins with CL0123 and CL0057, so it cannot discover DNA binding proteins outside those clans or proteins too diverged to match their profiles. It also cannot infer transcription factor activity from a domain alone. Recasting the study around a bounded catalog makes its quantitative claims testable and its novelty more precise.</w:t>
+        <w:t>The result is narrower than the original framing of a domain wide map of transcription factors. The workflow begins with CL0123 and CL0057, so it cannot discover DNA-binding proteins outside those clans or proteins too diverged to match their profiles. It also cannot infer transcription factor activity from a domain alone. Recasting the study around a bounded catalog makes its quantitative claims testable and its novelty more precise.</w:t>
       </w:r>
     </w:p>
     <w:p>
@@ -1029,7 +1045,7 @@
         <w:pStyle w:val="BodyText"/>
       </w:pPr>
       <w:r>
-        <w:t>The evidence is strongest for family coherence and for the conclusion that most proteins adopt known DNA binding folds. Genomic context suggests biological settings, but direct regulatory relationships remain unproven. Held out motif prediction strengthens the case that most tested families have recurrent family specific upstream sequence patterns. The negative target enrichment tests and the failures for nArcR 20 and nArcR 24 prevent a direct regulon claim. The phylogenetic analysis of ten families indicates within phylum clustering for eight, which is compatible with vertical inheritance or ancient origin but does not distinguish these mechanisms. The Haloferax volcanii transcriptomic analysis confirms expression for most mapped loci; its oxidative stress comparison is exploratory because the released script uses simple tests on three replicates per condition rather than a count based dispersion model.</w:t>
+        <w:t>The evidence is strongest for family coherence and for the conclusion that most proteins adopt known DNA-binding folds. Genomic context suggests biological settings, but direct regulatory relationships remain unproven. Held out motif prediction strengthens the case that most tested families have recurrent family specific upstream sequence patterns. The negative target enrichment tests and the failures for nArcR 20 and nArcR 24 prevent a direct regulon claim. The phylogenetic analysis of ten families indicates within phylum clustering for eight, which is compatible with vertical inheritance or ancient origin but does not distinguish these mechanisms. The Haloferax volcanii transcriptomic analysis confirms expression for most mapped loci; its oxidative stress comparison is exploratory because the released script uses simple tests on three replicates per condition rather than a count based dispersion model.</w:t>
       </w:r>
     </w:p>
     <w:p>
@@ -1054,7 +1070,10 @@
         <w:pStyle w:val="BodyText"/>
       </w:pPr>
       <w:r>
-        <w:t>First, the search universe is restricted to two Pfam clans. Second, the 5 bit reciprocal exclusion tolerance and the lineage caps lack a full de novo sensitivity analysis because the released archive omits the complete raw candidate and canonical domain hit tables and the 1,069 genome candidate pool. The independent projection analysis tests existing HMMs, not family rediscovery. Third, the final 3,526 genome prevalence summaries are supported by corrected tables, while the released raw matrices contain 3,192 genomes and should be treated as legacy intermediates. Fourth, the dependence corrected neighborhood and deep motif source tables cited in the manuscript are absent from the archive even though their figures are present. Fifth, computational motif prediction cannot replace direct binding assays. These limitations constrain claims of exhaustiveness, regulation, and full raw to figure reproducibility.</w:t>
+        <w:t>First, the search universe is restricted to two Pfam clans. Second, the 5-bit reciprocal exclusion tolerance and the lineage caps lack a full de novo sensitivity analysis because the released archive omits the complete raw candidate and canonical domain hit tables and the 1,069 genome candidate pool. The independent projection analysis tests existing HMMs, not family rediscovery. Third, the final 3,526 genome prevalence summaries are supported by corrected tables, while the released raw matrices contain 3,192 genomes and should be treated as legacy intermediates. Fourth, the dependence corrected neighborhood and deep motif source tables cited in the manuscript are absent from the archive even though their figures are present. Fifth, computational motif prediction cannot replace direct binding assays. These limitations constrain claims of exhaustiveness, regulation, and full raw to figure reproducibility.</w:t>
+      </w:r>
+      <w:r>
+        <w:t xml:space="preserve"> Sixth, source and assembly-quality strata differ in lineage composition, so their prevalence contrasts are descriptive. Seventh, genus-blocked motif validation attenuates support for several motifs and confirms that genome-level holdout alone does not eliminate phylogenetic signal.</w:t>
       </w:r>
     </w:p>
     <w:p>
@@ -1097,7 +1116,7 @@
         <w:pStyle w:val="BodyText"/>
       </w:pPr>
       <w:r>
-        <w:t>Pfam profiles in clans CL0123 and CL0057 were designated the search universe. Twenty models representing the nineteen family canonical set were separated from 747 candidate profiles. HMMER searches used each model gathering threshold. For every protein, the highest domain score candidate interval, with coordinates ali_from to ali_to, was compared with the highest scoring canonical hit. Interval overlap was calculated as the number of shared aligned residues divided by the candidate interval length. A candidate was excluded when overlap exceeded 0.5 and canonical score was at least candidate score minus 5 bits. Otherwise it was retained. When multiple candidate domains remained on a protein, the highest scoring retained candidate was used in family construction.</w:t>
+        <w:t>Pfam profiles in clans CL0123 and CL0057 were designated the search universe. Twenty models representing the nineteen family canonical set were separated from 747 candidate profiles. HMMER searches used each model gathering threshold. For every protein, the highest domain score candidate interval, with coordinates ali_from to ali_to, was compared with the highest scoring canonical hit. Interval overlap was calculated as the number of shared aligned residues divided by the candidate interval length. A candidate was excluded when overlap exceeded 0.5 and canonical score was at least candidate score minus 5-bits. Otherwise it was retained. When multiple candidate domains remained on a protein, the highest scoring retained candidate was used in family construction.</w:t>
       </w:r>
     </w:p>
     <w:p>
@@ -1152,6 +1171,14 @@
     </w:p>
     <w:p>
       <w:pPr>
+        <w:pStyle w:val="BodyText"/>
+      </w:pPr>
+      <w:r>
+        <w:t>For the quality sensitivity analysis, projection genomes were grouped by isolate, metagenome-assembled genome, or single-amplified genome status; by complete/chromosome, scaffold, or contig assembly; and by whether reported completeness was at least 90 percent with contamination at most 5 percent. We reported denominators, per-family prevalence, and the number of detected families for each stratum. No inferential comparison was made because these variables are confounded with lineage and database sampling.</w:t>
+      </w:r>
+    </w:p>
+    <w:p>
+      <w:pPr>
         <w:pStyle w:val="Heading2"/>
         <w:keepNext/>
       </w:pPr>
@@ -1164,7 +1191,7 @@
         <w:pStyle w:val="BodyText"/>
       </w:pPr>
       <w:r>
-        <w:t>Genes within five coding sequences of family members were assigned functional categories. Initial family category enrichment used genome conditioned label sampling, binomial tests, and Benjamini Hochberg correction [35]. Strong links were retested after collapse to one observation per genus and by shuffling whole neighborhood blocks for 2,000 permutations with seed 42. Up to 250 strand aware upstream nucleotides were used for motif discovery under a zero or one occurrence model. Motif information content was tested against mononucleotide shuffle, dinucleotide shuffle, and shuffled family assignment nulls with 100 replicates each and false discovery rate control. Six flagship family motifs were additionally assessed with 1,000 permutations and scanned against upstream regions of predicted target genes.</w:t>
+        <w:t>Genes within five coding sequences of family members were assigned functional categories. Initial family category enrichment used genome conditioned label sampling, binomial tests, and Benjamini Hochberg correction [35]. Strong links were retested after collapse to one observation per genus and by shuffling whole neighborhood blocks for 2,000 permutations with seed 42. Up to 250 strand aware upstream nucleotides were used for motif discovery under a zero or one occurrence model. Motif information content was tested against mononucleotide shuffle, dinucleotide shuffle, and shuffled family assignment nulls with 100 replicates each and false-discovery-rate control. Six flagship family motifs were additionally assessed with 1,000 permutations and scanned against upstream regions of predicted target genes.</w:t>
       </w:r>
     </w:p>
     <w:p>
@@ -1172,7 +1199,15 @@
         <w:pStyle w:val="BodyText"/>
       </w:pPr>
       <w:r>
-        <w:t>For the genome level motif holdout analysis, genomes within each of 12 families were randomly divided into 70 percent training and 30 percent testing sets for 30 seeded replicates. A position weight matrix was learned only from training sequences under a zero or one occurrence model and scored in both orientations on held out upstreams. Each held out set was compared with dinucleotide shuffled versions of the same sequences and with equally sized, GC matched upstream sets from other families. Discrimination was summarized by area under the receiver operating characteristic curve, its 2.5 and 97.5 percent resampling quantiles, and the fraction of splits with AUC above 0.5. Because the splits overlap, no inferential test treats them as independent observations.</w:t>
+        <w:t>For the genome-level motif holdout analysis, genomes within each of 12 families were randomly divided into 70 percent training and 30 percent testing sets for 30 seeded replicates. A position weight matrix was learned only from training sequences under a zero or one occurrence model and scored in both orientations on held out upstreams. Each held out set was compared with dinucleotide shuffled versions of the same sequences and with equally sized, GC matched upstream sets from other families. Discrimination was summarized by area under the receiver operating characteristic curve, its 2.5 and 97.5 percent resampling quantiles, and the fraction of splits with AUC above 0.5. Because the splits overlap, no inferential test treats them as independent observations.</w:t>
+      </w:r>
+    </w:p>
+    <w:p>
+      <w:pPr>
+        <w:pStyle w:val="BodyText"/>
+      </w:pPr>
+      <w:r>
+        <w:t>For genus-blocked validation, genera rather than genomes were randomly assigned to the 70/30 training and testing partitions. All upstream sequences from a held-out genus remained in the test set. The same PWM fitting, dinucleotide-shuffle control, GC-matched other-family control, AUC summaries, 30 replicate count, and descriptive interpretation were used. Train/test genus overlap was checked and was zero for every family and replicate.</w:t>
       </w:r>
     </w:p>
     <w:p>
@@ -1214,7 +1249,7 @@
         <w:pStyle w:val="BodyText"/>
       </w:pPr>
       <w:r>
-        <w:t>The accompanying repository preserves the original analysis scripts and adds a portable Python package, pinned environments, automated tests, a continuous integration workflow, independent projection resampling, and genome level motif holdout validation. Versioned replicate level outputs, summaries, and figures accompany the new analyses. A reproducibility audit identifies missing source tables and legacy projection matrices. The repository supports verification of many reported summaries but is not a complete raw to figure rerun because the full candidate pool and raw canonical and candidate HMM hit tables are unavailable.</w:t>
+        <w:t>The accompanying repository preserves the original analysis scripts and adds a portable Python package, exact Python dependency pins, an external-tool environment, a container recipe, automated tests, a minimal worked example, SHA-256 checksums, independent projection resampling, genome- and genus-blocked motif validation, and genome-quality sensitivity. Versioned replicate-level outputs, summaries, figures, and a supplementary item index accompany the analyses. A reproducibility audit identifies missing source tables, unspecified historical database releases, and the legacy 3,192-genome matrices. The repository supports verification of many reported summaries but is not a complete raw-to-figure rerun because the full candidate pool, raw HMM hits, and corrected 3,526-genome matrices are unavailable. An archival DOI will be added only after deposit.</w:t>
       </w:r>
     </w:p>
     <w:p>
@@ -1231,7 +1266,87 @@
         <w:pStyle w:val="BodyText"/>
       </w:pPr>
       <w:r>
-        <w:t>A search bounded to two major archaeal HTH and RHH Pfam clans identifies 250 coherent sequence families outside a nineteen family reference set. Most apparent novelty resolves to known sequence or structural classes, while nine families remain unresolved by the resources tested. The catalog expands the map of archaeal DNA binding domain diversity and prioritizes experiments, but it does not by itself establish 250 transcription factor families or a comprehensive archaeal regulome.</w:t>
+        <w:t>A search bounded to two major archaeal HTH and RHH Pfam clans identifies 250 coherent sequence families outside a nineteen family reference set. Most apparent novelty resolves to known sequence or structural classes, while nine families remain unresolved by the resources tested. The catalog expands the documented diversity of archaeal DNA-binding domains and prioritizes experiments, but it does not by itself establish 250 transcription factor families or a comprehensive archaeal regulome.</w:t>
+      </w:r>
+    </w:p>
+    <w:p>
+      <w:pPr>
+        <w:pStyle w:val="Heading1"/>
+      </w:pPr>
+      <w:r>
+        <w:t>Author contributions</w:t>
+      </w:r>
+    </w:p>
+    <w:p>
+      <w:pPr>
+        <w:pStyle w:val="BodyText"/>
+      </w:pPr>
+      <w:r>
+        <w:t>Ajay Vellanki and Shaurya Dosapati contributed equally. Specific CRediT roles must be confirmed by both authors before submission.</w:t>
+      </w:r>
+    </w:p>
+    <w:p>
+      <w:pPr>
+        <w:pStyle w:val="Heading1"/>
+      </w:pPr>
+      <w:r>
+        <w:t>Funding</w:t>
+      </w:r>
+    </w:p>
+    <w:p>
+      <w:pPr>
+        <w:pStyle w:val="BodyText"/>
+      </w:pPr>
+      <w:r>
+        <w:t>Funding information: [Authors to complete before submission; do not submit with this placeholder.]</w:t>
+      </w:r>
+    </w:p>
+    <w:p>
+      <w:pPr>
+        <w:pStyle w:val="Heading1"/>
+      </w:pPr>
+      <w:r>
+        <w:t>Competing interests</w:t>
+      </w:r>
+    </w:p>
+    <w:p>
+      <w:pPr>
+        <w:pStyle w:val="BodyText"/>
+      </w:pPr>
+      <w:r>
+        <w:t>Competing-interests statement: [Both authors to confirm before submission; do not submit with this placeholder.]</w:t>
+      </w:r>
+    </w:p>
+    <w:p>
+      <w:pPr>
+        <w:pStyle w:val="Heading1"/>
+      </w:pPr>
+      <w:r>
+        <w:t>Ethics statement</w:t>
+      </w:r>
+    </w:p>
+    <w:p>
+      <w:pPr>
+        <w:pStyle w:val="BodyText"/>
+      </w:pPr>
+      <w:r>
+        <w:t>This computational study analyzed publicly available genomic, structural, and transcriptomic data and involved no human participants or live vertebrate animals; institutional ethics approval was not required.</w:t>
+      </w:r>
+    </w:p>
+    <w:p>
+      <w:pPr>
+        <w:pStyle w:val="Heading1"/>
+      </w:pPr>
+      <w:r>
+        <w:t>Data and code availability</w:t>
+      </w:r>
+    </w:p>
+    <w:p>
+      <w:pPr>
+        <w:pStyle w:val="BodyText"/>
+      </w:pPr>
+      <w:r>
+        <w:t>Code, deposited data, checksums, software environments, and versioned analysis outputs are available in the accompanying GitHub repository. The repository documents all unavailable source tables and the distinct 3,192- and 3,526-genome data scopes. A persistent archive DOI will be inserted after release deposition.</w:t>
       </w:r>
     </w:p>
     <w:p>
@@ -1252,7 +1367,7 @@
         <w:rPr>
           <w:sz w:val="17"/>
         </w:rPr>
-        <w:t>1. Aravind L et al. DNA binding proteins and evolution of transcription regulation in the archaea. Nucleic Acids Research. 1999. https://doi.org/10.1093/nar/27.23.4658</w:t>
+        <w:t>1. Aravind L et al. DNA-binding proteins and evolution of transcription regulation in the archaea. Nucleic Acids Research. 1999. https://doi.org/10.1093/nar/27.23.4658</w:t>
       </w:r>
     </w:p>
     <w:p>
@@ -1264,7 +1379,7 @@
         <w:rPr>
           <w:sz w:val="17"/>
         </w:rPr>
-        <w:t>2. Dodd IB et al. Improved detection of helix turn helix DNA binding motifs in protein sequences. Nucleic Acids Research. 1990. https://doi.org/10.1093/nar/18.17.5019</w:t>
+        <w:t>2. Dodd IB et al. Improved detection of helix-turn-helix DNA-binding motifs in protein sequences. Nucleic Acids Research. 1990. https://doi.org/10.1093/nar/18.17.5019</w:t>
       </w:r>
     </w:p>
     <w:p>
@@ -1660,7 +1775,7 @@
         <w:rPr>
           <w:sz w:val="17"/>
         </w:rPr>
-        <w:t>35. Benjamini Y and Hochberg Y. Controlling the false discovery rate. Journal of the Royal Statistical Society Series B. 1995. https://doi.org/10.1111/j.2517-6161.1995.tb02031.x</w:t>
+        <w:t>35. Benjamini Y and Hochberg Y. Controlling the false-discovery-rate. Journal of the Royal Statistical Society Series B. 1995. https://doi.org/10.1111/j.2517-6161.1995.tb02031.x</w:t>
       </w:r>
     </w:p>
     <w:p>

</xml_diff>

<commit_message>
Add extended robustness analyses and validation protocols
</commit_message>
<xml_diff>
--- a/manuscript/Revised_archaeal_DBD_manuscript.docx
+++ b/manuscript/Revised_archaeal_DBD_manuscript.docx
@@ -707,6 +707,14 @@
         <w:pStyle w:val="BodyText"/>
       </w:pPr>
       <w:r>
+        <w:t>The only released protein-sequence collection suitable for an additional boundary check contains 782 sequences from ten phylogenetic example families. In leave-one-sequence-out classification using dipeptide-composition centroids, family-specific accuracies ranged from 0.775 to 0.963. This alignment-free result supports compositional separability in that subset only; it does not validate the remaining 240 family boundaries.</w:t>
+      </w:r>
+    </w:p>
+    <w:p>
+      <w:pPr>
+        <w:pStyle w:val="BodyText"/>
+      </w:pPr>
+      <w:r>
         <w:t>Projection placed the families across an accounting set of 3,526 archaeal genomes: 1,324 isolates, 1,986 metagenome-assembled genomes, and 216 single-amplified genomes. Corrected prevalence was recomputed against the full lineage denominators after 379 initially zero hit genomes were rescued by HMM scanning. The released raw presence absence and copy number matrices contain only the earlier 3,192 genome pass; therefore corrected prevalence tables, not those legacy matrices, support the 3,526 genome summaries. Because MAGs and SAGs may be incomplete, no confident hit is not equivalent to confirmed biological absence.</w:t>
       </w:r>
     </w:p>
@@ -724,6 +732,14 @@
       </w:pPr>
       <w:r>
         <w:t>We next stratified the accession-resolved 3,192-genome projection by genome origin, assembly level, and reported completeness/contamination. Each stratum retained 242–249 of the 250 families, except the smaller single-amplified-genome stratum, which retained 205. Median per-family prevalence varied from 0.025 in MAGs to 0.068 in isolates and from 0.034 in scaffold assemblies to 0.072 in complete/chromosome assemblies. These descriptive shifts are confounded by lineage and sampling, but they show why non-detection and cross-stratum prevalence differences must be interpreted conservatively.</w:t>
+      </w:r>
+    </w:p>
+    <w:p>
+      <w:pPr>
+        <w:pStyle w:val="BodyText"/>
+      </w:pPr>
+      <w:r>
+        <w:t>To reduce genome-level pseudoreplication, we inferred 533 genus labels from the deposited organism names and resampled genera as clusters for 1,000 replicates. Genome-weighted and genus-balanced prevalence differed appreciably for some families, and the versioned table reports both estimates with cluster-bootstrap intervals. Because the release lacks a versioned taxonomy and species tree, this is a taxonomic-cluster sensitivity analysis rather than formal phylogenetic comparative inference.</w:t>
       </w:r>
     </w:p>
     <w:p>
@@ -863,6 +879,14 @@
     </w:p>
     <w:p>
       <w:pPr>
+        <w:pStyle w:val="BodyText"/>
+      </w:pPr>
+      <w:r>
+        <w:t>We then left out one major archaeal lineage at a time and used only same-lineage other-family controls. Ten of 12 families had at least one evaluable block under the minimum sample-size rules; nArcR-17 and nArcR-46 did not. Performance varied substantially among lineages, so block-level values rather than a pooled significance claim are reported. This is the most conservative deposited motif transfer analysis and further limits any general binding interpretation.</w:t>
+      </w:r>
+    </w:p>
+    <w:p>
+      <w:pPr>
         <w:jc w:val="center"/>
       </w:pPr>
       <w:r>
@@ -1073,7 +1097,7 @@
         <w:t>First, the search universe is restricted to two Pfam clans. Second, the 5-bit reciprocal exclusion tolerance and the lineage caps lack a full de novo sensitivity analysis because the released archive omits the complete raw candidate and canonical domain hit tables and the 1,069 genome candidate pool. The independent projection analysis tests existing HMMs, not family rediscovery. Third, the final 3,526 genome prevalence summaries are supported by corrected tables, while the released raw matrices contain 3,192 genomes and should be treated as legacy intermediates. Fourth, the dependence corrected neighborhood and deep motif source tables cited in the manuscript are absent from the archive even though their figures are present. Fifth, computational motif prediction cannot replace direct binding assays. These limitations constrain claims of exhaustiveness, regulation, and full raw to figure reproducibility.</w:t>
       </w:r>
       <w:r>
-        <w:t xml:space="preserve"> Sixth, source and assembly-quality strata differ in lineage composition, so their prevalence contrasts are descriptive. Seventh, genus-blocked motif validation attenuates support for several motifs and confirms that genome-level holdout alone does not eliminate phylogenetic signal.</w:t>
+        <w:t xml:space="preserve"> Sixth, source and assembly-quality strata differ in lineage composition, so their prevalence contrasts are descriptive. Seventh, genus- and lineage-blocked motif validation attenuates support for several motifs and confirms that genome-level holdout alone does not eliminate phylogenetic signal. Eighth, the genus-clustered prevalence analysis uses organism-name labels rather than a versioned taxonomy or species tree. Ninth, the additional family-separability check covers only the ten families with released protein sequences.</w:t>
       </w:r>
     </w:p>
     <w:p>
@@ -1166,6 +1190,14 @@
         <w:pStyle w:val="BodyText"/>
       </w:pPr>
       <w:r>
+        <w:t>For the released ten-family sequence subset, each protein was represented by normalized dipeptide frequencies. The sequence was removed from its own family centroid, cosine similarities to all family centroids were calculated, and the highest-scoring family was assigned. Exact binomial 95 percent intervals and the own-family minus nearest-other-family similarity margin were reported. The analysis was not extrapolated beyond the released subset.</w:t>
+      </w:r>
+    </w:p>
+    <w:p>
+      <w:pPr>
+        <w:pStyle w:val="BodyText"/>
+      </w:pPr>
+      <w:r>
         <w:t>For independent genome validation, discovery panel accessions were removed from the legacy 3,192 genome presence absence matrix. Five hundred samples were then drawn without replacement using the discovery panel lineage counts: 140 Euryarchaeota, 70 Crenarchaeota and other TACK, 51 Thaumarchaeota, 33 DPANN, 19 Asgardarchaeota, 15 other deep TACK, and 3 Korarchaeota. For each sample we counted families detected at least once and in at least five genomes. The procedure used fixed family HMM projections and therefore measures transferability rather than de novo discovery.</w:t>
       </w:r>
     </w:p>
@@ -1179,6 +1211,14 @@
     </w:p>
     <w:p>
       <w:pPr>
+        <w:pStyle w:val="BodyText"/>
+      </w:pPr>
+      <w:r>
+        <w:t>For clustered prevalence uncertainty, genus labels were inferred from deposited organism names, with Candidatus names retaining the following token. Genera were sampled with replacement for 1,000 seeded replicates. We calculated genus-balanced prevalence and a cluster-weighted prevalence interval for each family. This analysis addresses clustered sampling but does not model a species phylogeny.</w:t>
+      </w:r>
+    </w:p>
+    <w:p>
+      <w:pPr>
         <w:pStyle w:val="Heading2"/>
         <w:keepNext/>
       </w:pPr>
@@ -1212,6 +1252,14 @@
     </w:p>
     <w:p>
       <w:pPr>
+        <w:pStyle w:val="BodyText"/>
+      </w:pPr>
+      <w:r>
+        <w:t>For leave-one-major-lineage-out validation, each lineage with at least five target sequences was held out in turn. Training required at least twenty sequences, and the comparison required enough other-family upstreams from the same held-out lineage. A PWM learned from all remaining lineages was evaluated against dinucleotide-shuffled targets and GC-matched same-lineage controls. Blocks failing any minimum were reported as unevaluable rather than pooled.</w:t>
+      </w:r>
+    </w:p>
+    <w:p>
+      <w:pPr>
         <w:pStyle w:val="Heading2"/>
         <w:keepNext/>
       </w:pPr>
@@ -1249,7 +1297,7 @@
         <w:pStyle w:val="BodyText"/>
       </w:pPr>
       <w:r>
-        <w:t>The accompanying repository preserves the original analysis scripts and adds a portable Python package, exact Python dependency pins, an external-tool environment, a container recipe, automated tests, a minimal worked example, SHA-256 checksums, independent projection resampling, genome- and genus-blocked motif validation, and genome-quality sensitivity. Versioned replicate-level outputs, summaries, figures, and a supplementary item index accompany the analyses. A reproducibility audit identifies missing source tables, unspecified historical database releases, and the legacy 3,192-genome matrices. The repository supports verification of many reported summaries but is not a complete raw-to-figure rerun because the full candidate pool, raw HMM hits, and corrected 3,526-genome matrices are unavailable. An archival DOI will be added only after deposit.</w:t>
+        <w:t>The accompanying repository preserves the original analysis scripts and adds a portable Python package, exact dependency pins, a container recipe, automated tests, a worked example, SHA-256 checksums, independent projection resampling, taxonomically blocked motif validation, genome-quality sensitivity, genus-clustered prevalence intervals, and ten-family sequence separability. It also contains frozen protocols and input gates for independent discovery, HMM error calibration, external annotation, discovery-parameter sensitivity, experimental validation, and blind reproduction. The repository supports verification of many summaries but is not a complete raw-to-figure rerun because the full candidate pool, raw HMM hits, corrected 3,526-genome matrices, several source tables, and complete family sequences are unavailable. An archival DOI will be added only after deposit.</w:t>
       </w:r>
     </w:p>
     <w:p>

</xml_diff>